<commit_message>
1012736: Digital Signature support added
</commit_message>
<xml_diff>
--- a/Automated-Loan-Agreement/.NET/Automated-Loan-Agreement/wwwroot/Data/Template.docx
+++ b/Automated-Loan-Agreement/.NET/Automated-Loan-Agreement/wwwroot/Data/Template.docx
@@ -21,7 +21,7 @@
           <w:rFonts w:ascii="Calibri" w:eastAsia="Arial" w:hAnsi="Calibri" w:cs="Calibri"/>
           <w:bCs/>
         </w:rPr>
-        <w:instrText xml:space="preserve"> MERGEFIELD  TableStart:AgreementDetails \* MERGEFORMAT </w:instrText>
+        <w:instrText xml:space="preserve"> MERGEFIELD  BeginGroup:AgreementDetails  \* MERGEFORMAT </w:instrText>
       </w:r>
       <w:r>
         <w:rPr>
@@ -36,7 +36,7 @@
           <w:bCs/>
           <w:noProof/>
         </w:rPr>
-        <w:t>«TableStart:AgreementDetails»</w:t>
+        <w:t>«BeginGroup:AgreementDetails»</w:t>
       </w:r>
       <w:r>
         <w:rPr>
@@ -1696,14 +1696,6 @@
                 <w:szCs w:val="24"/>
               </w:rPr>
             </w:pPr>
-            <w:r>
-              <w:rPr>
-                <w:rFonts w:ascii="Calibri" w:hAnsi="Calibri" w:cs="Calibri"/>
-                <w:sz w:val="24"/>
-                <w:szCs w:val="24"/>
-              </w:rPr>
-              <w:t>_____________________</w:t>
-            </w:r>
           </w:p>
         </w:tc>
         <w:tc>
@@ -1718,14 +1710,6 @@
                 <w:szCs w:val="24"/>
               </w:rPr>
             </w:pPr>
-            <w:r>
-              <w:rPr>
-                <w:rFonts w:ascii="Calibri" w:hAnsi="Calibri" w:cs="Calibri"/>
-                <w:sz w:val="24"/>
-                <w:szCs w:val="24"/>
-              </w:rPr>
-              <w:t>____________________</w:t>
-            </w:r>
           </w:p>
         </w:tc>
       </w:tr>
@@ -1770,7 +1754,7 @@
                 <w:sz w:val="24"/>
                 <w:szCs w:val="24"/>
               </w:rPr>
-              <w:t>Authorized Signatory</w:t>
+              <w:t>AuthorizedSign</w:t>
             </w:r>
           </w:p>
         </w:tc>
@@ -1931,12 +1915,6 @@
           <w:rFonts w:ascii="Calibri" w:hAnsi="Calibri" w:cs="Calibri"/>
         </w:rPr>
       </w:pPr>
-      <w:r>
-        <w:rPr>
-          <w:rFonts w:ascii="Calibri" w:hAnsi="Calibri" w:cs="Calibri"/>
-        </w:rPr>
-        <w:t>_______________________</w:t>
-      </w:r>
     </w:p>
     <w:p>
       <w:pPr>
@@ -1985,12 +1963,6 @@
         </w:rPr>
         <w:fldChar w:fldCharType="end"/>
       </w:r>
-      <w:r>
-        <w:rPr>
-          <w:rFonts w:ascii="Calibri" w:hAnsi="Calibri" w:cs="Calibri"/>
-        </w:rPr>
-        <w:tab/>
-      </w:r>
     </w:p>
     <w:p>
       <w:pPr>
@@ -2056,7 +2028,7 @@
           <w:rFonts w:ascii="Calibri" w:eastAsia="Arial" w:hAnsi="Calibri" w:cs="Calibri"/>
           <w:bCs/>
         </w:rPr>
-        <w:instrText xml:space="preserve"> MERGEFIELD  TableEnd:AgreementDetails  \* MERGEFORMAT </w:instrText>
+        <w:instrText xml:space="preserve"> MERGEFIELD  EndGroup:AgreementDetails  \* MERGEFORMAT </w:instrText>
       </w:r>
       <w:r>
         <w:rPr>
@@ -2071,7 +2043,7 @@
           <w:bCs/>
           <w:noProof/>
         </w:rPr>
-        <w:t>«TableEnd:AgreementDetails»</w:t>
+        <w:t>«EndGroup:AgreementDetails»</w:t>
       </w:r>
       <w:r>
         <w:rPr>

</xml_diff>